<commit_message>
docs: synchronize proof screenshots with real Antigravity IDE light theme and update reports
</commit_message>
<xml_diff>
--- a/N24DCDT051_DT046_NguyenHoangNam_BaoCao_TienDo2.docx
+++ b/N24DCDT051_DT046_NguyenHoangNam_BaoCao_TienDo2.docx
@@ -19344,7 +19344,7 @@
             <w:r>
               <w:drawing>
                 <wp:inline xmlns:a="http://schemas.openxmlformats.org/drawingml/2006/main" xmlns:pic="http://schemas.openxmlformats.org/drawingml/2006/picture">
-                  <wp:extent cx="5303520" cy="2303243"/>
+                  <wp:extent cx="5303520" cy="2978051"/>
                   <wp:docPr id="1" name="Picture 1"/>
                   <wp:cNvGraphicFramePr>
                     <a:graphicFrameLocks noChangeAspect="1"/>
@@ -19365,7 +19365,7 @@
                         <pic:spPr>
                           <a:xfrm>
                             <a:off x="0" y="0"/>
-                            <a:ext cx="5303520" cy="2303243"/>
+                            <a:ext cx="5303520" cy="2978051"/>
                           </a:xfrm>
                           <a:prstGeom prst="rect"/>
                         </pic:spPr>
@@ -19612,7 +19612,7 @@
             <w:r>
               <w:drawing>
                 <wp:inline xmlns:a="http://schemas.openxmlformats.org/drawingml/2006/main" xmlns:pic="http://schemas.openxmlformats.org/drawingml/2006/picture">
-                  <wp:extent cx="5303520" cy="1818350"/>
+                  <wp:extent cx="5303520" cy="2978051"/>
                   <wp:docPr id="2" name="Picture 2"/>
                   <wp:cNvGraphicFramePr>
                     <a:graphicFrameLocks noChangeAspect="1"/>
@@ -19633,7 +19633,7 @@
                         <pic:spPr>
                           <a:xfrm>
                             <a:off x="0" y="0"/>
-                            <a:ext cx="5303520" cy="1818350"/>
+                            <a:ext cx="5303520" cy="2978051"/>
                           </a:xfrm>
                           <a:prstGeom prst="rect"/>
                         </pic:spPr>
@@ -19796,7 +19796,7 @@
             <w:r>
               <w:drawing>
                 <wp:inline xmlns:a="http://schemas.openxmlformats.org/drawingml/2006/main" xmlns:pic="http://schemas.openxmlformats.org/drawingml/2006/picture">
-                  <wp:extent cx="5303520" cy="1818350"/>
+                  <wp:extent cx="5303520" cy="2978051"/>
                   <wp:docPr id="3" name="Picture 3"/>
                   <wp:cNvGraphicFramePr>
                     <a:graphicFrameLocks noChangeAspect="1"/>
@@ -19817,7 +19817,7 @@
                         <pic:spPr>
                           <a:xfrm>
                             <a:off x="0" y="0"/>
-                            <a:ext cx="5303520" cy="1818350"/>
+                            <a:ext cx="5303520" cy="2978051"/>
                           </a:xfrm>
                           <a:prstGeom prst="rect"/>
                         </pic:spPr>
@@ -19965,7 +19965,7 @@
             <w:r>
               <w:drawing>
                 <wp:inline xmlns:a="http://schemas.openxmlformats.org/drawingml/2006/main" xmlns:pic="http://schemas.openxmlformats.org/drawingml/2006/picture">
-                  <wp:extent cx="5303520" cy="1818350"/>
+                  <wp:extent cx="5303520" cy="2978051"/>
                   <wp:docPr id="4" name="Picture 4"/>
                   <wp:cNvGraphicFramePr>
                     <a:graphicFrameLocks noChangeAspect="1"/>
@@ -19986,7 +19986,7 @@
                         <pic:spPr>
                           <a:xfrm>
                             <a:off x="0" y="0"/>
-                            <a:ext cx="5303520" cy="1818350"/>
+                            <a:ext cx="5303520" cy="2978051"/>
                           </a:xfrm>
                           <a:prstGeom prst="rect"/>
                         </pic:spPr>
@@ -20182,7 +20182,7 @@
             <w:r>
               <w:drawing>
                 <wp:inline xmlns:a="http://schemas.openxmlformats.org/drawingml/2006/main" xmlns:pic="http://schemas.openxmlformats.org/drawingml/2006/picture">
-                  <wp:extent cx="5303520" cy="1697126"/>
+                  <wp:extent cx="5303520" cy="2978051"/>
                   <wp:docPr id="5" name="Picture 5"/>
                   <wp:cNvGraphicFramePr>
                     <a:graphicFrameLocks noChangeAspect="1"/>
@@ -20203,7 +20203,7 @@
                         <pic:spPr>
                           <a:xfrm>
                             <a:off x="0" y="0"/>
-                            <a:ext cx="5303520" cy="1697126"/>
+                            <a:ext cx="5303520" cy="2978051"/>
                           </a:xfrm>
                           <a:prstGeom prst="rect"/>
                         </pic:spPr>
@@ -20351,7 +20351,7 @@
             <w:r>
               <w:drawing>
                 <wp:inline xmlns:a="http://schemas.openxmlformats.org/drawingml/2006/main" xmlns:pic="http://schemas.openxmlformats.org/drawingml/2006/picture">
-                  <wp:extent cx="5303520" cy="1697126"/>
+                  <wp:extent cx="5303520" cy="2978051"/>
                   <wp:docPr id="6" name="Picture 6"/>
                   <wp:cNvGraphicFramePr>
                     <a:graphicFrameLocks noChangeAspect="1"/>
@@ -20372,7 +20372,7 @@
                         <pic:spPr>
                           <a:xfrm>
                             <a:off x="0" y="0"/>
-                            <a:ext cx="5303520" cy="1697126"/>
+                            <a:ext cx="5303520" cy="2978051"/>
                           </a:xfrm>
                           <a:prstGeom prst="rect"/>
                         </pic:spPr>
@@ -20553,7 +20553,7 @@
             <w:r>
               <w:drawing>
                 <wp:inline xmlns:a="http://schemas.openxmlformats.org/drawingml/2006/main" xmlns:pic="http://schemas.openxmlformats.org/drawingml/2006/picture">
-                  <wp:extent cx="5303520" cy="1818350"/>
+                  <wp:extent cx="5303520" cy="2978051"/>
                   <wp:docPr id="7" name="Picture 7"/>
                   <wp:cNvGraphicFramePr>
                     <a:graphicFrameLocks noChangeAspect="1"/>
@@ -20574,7 +20574,7 @@
                         <pic:spPr>
                           <a:xfrm>
                             <a:off x="0" y="0"/>
-                            <a:ext cx="5303520" cy="1818350"/>
+                            <a:ext cx="5303520" cy="2978051"/>
                           </a:xfrm>
                           <a:prstGeom prst="rect"/>
                         </pic:spPr>
@@ -20724,7 +20724,7 @@
             <w:r>
               <w:drawing>
                 <wp:inline xmlns:a="http://schemas.openxmlformats.org/drawingml/2006/main" xmlns:pic="http://schemas.openxmlformats.org/drawingml/2006/picture">
-                  <wp:extent cx="5303520" cy="2424466"/>
+                  <wp:extent cx="5303520" cy="2978051"/>
                   <wp:docPr id="8" name="Picture 8"/>
                   <wp:cNvGraphicFramePr>
                     <a:graphicFrameLocks noChangeAspect="1"/>
@@ -20745,7 +20745,7 @@
                         <pic:spPr>
                           <a:xfrm>
                             <a:off x="0" y="0"/>
-                            <a:ext cx="5303520" cy="2424466"/>
+                            <a:ext cx="5303520" cy="2978051"/>
                           </a:xfrm>
                           <a:prstGeom prst="rect"/>
                         </pic:spPr>
@@ -20895,7 +20895,7 @@
             <w:r>
               <w:drawing>
                 <wp:inline xmlns:a="http://schemas.openxmlformats.org/drawingml/2006/main" xmlns:pic="http://schemas.openxmlformats.org/drawingml/2006/picture">
-                  <wp:extent cx="5303520" cy="3030583"/>
+                  <wp:extent cx="5303520" cy="2978051"/>
                   <wp:docPr id="9" name="Picture 9"/>
                   <wp:cNvGraphicFramePr>
                     <a:graphicFrameLocks noChangeAspect="1"/>
@@ -20916,7 +20916,7 @@
                         <pic:spPr>
                           <a:xfrm>
                             <a:off x="0" y="0"/>
-                            <a:ext cx="5303520" cy="3030583"/>
+                            <a:ext cx="5303520" cy="2978051"/>
                           </a:xfrm>
                           <a:prstGeom prst="rect"/>
                         </pic:spPr>
@@ -22216,7 +22216,7 @@
             <w:r>
               <w:drawing>
                 <wp:inline xmlns:a="http://schemas.openxmlformats.org/drawingml/2006/main" xmlns:pic="http://schemas.openxmlformats.org/drawingml/2006/picture">
-                  <wp:extent cx="5303520" cy="2788136"/>
+                  <wp:extent cx="5303520" cy="2978051"/>
                   <wp:docPr id="10" name="Picture 10"/>
                   <wp:cNvGraphicFramePr>
                     <a:graphicFrameLocks noChangeAspect="1"/>
@@ -22237,7 +22237,7 @@
                         <pic:spPr>
                           <a:xfrm>
                             <a:off x="0" y="0"/>
-                            <a:ext cx="5303520" cy="2788136"/>
+                            <a:ext cx="5303520" cy="2978051"/>
                           </a:xfrm>
                           <a:prstGeom prst="rect"/>
                         </pic:spPr>
@@ -22353,7 +22353,7 @@
             <w:r>
               <w:drawing>
                 <wp:inline xmlns:a="http://schemas.openxmlformats.org/drawingml/2006/main" xmlns:pic="http://schemas.openxmlformats.org/drawingml/2006/picture">
-                  <wp:extent cx="5303520" cy="3434661"/>
+                  <wp:extent cx="5303520" cy="2978051"/>
                   <wp:docPr id="11" name="Picture 11"/>
                   <wp:cNvGraphicFramePr>
                     <a:graphicFrameLocks noChangeAspect="1"/>
@@ -22374,7 +22374,7 @@
                         <pic:spPr>
                           <a:xfrm>
                             <a:off x="0" y="0"/>
-                            <a:ext cx="5303520" cy="3434661"/>
+                            <a:ext cx="5303520" cy="2978051"/>
                           </a:xfrm>
                           <a:prstGeom prst="rect"/>
                         </pic:spPr>

</xml_diff>

<commit_message>
docs: update real GitHub repo screenshot and finalize milestone 2 deliverables
</commit_message>
<xml_diff>
--- a/N24DCDT051_DT046_NguyenHoangNam_BaoCao_TienDo2.docx
+++ b/N24DCDT051_DT046_NguyenHoangNam_BaoCao_TienDo2.docx
@@ -1063,7 +1063,7 @@
               <w:sdtEndPr/>
               <w:sdtContent>
                 <w:r>
-                  <w:t>31/10/2026 (Tiến độ 2 - Commit 6a186ea)</w:t>
+                  <w:t>31/10/2026 (Tiến độ 2 - Commit 43bc4a3)</w:t>
                 </w:r>
               </w:sdtContent>
             </w:sdt>
@@ -2935,7 +2935,7 @@
         <w:sdtEndPr/>
         <w:sdtContent>
           <w:r>
-            <w:t>Báo cáo tiến độ 2 (Mốc 2) hoàn thành toàn diện các mục tiêu trọng tâm của đề tài DT046: Tìm đồng thời giá trị nhỏ nhất và lớn nhất. Về mặt lý thuyết, đồ án đã phân tích chi tiết nguyên lý chia để trị, cơ chế tối ưu tại trường hợp cơ sở 2 phần tử (chỉ tốn đúng 1 phép so sánh giá trị) và bước ghép 2 nửa (tốn 2 phép so sánh), thiết lập và giải hệ thức đệ quy T(n) = 2T(n/2) + 2 để chứng minh số phép so sánh đạt 3n/2 - 2 khi n là lũy thừa 2, tiết kiệm khoảng 25% số phép so sánh so với phương pháp duyệt tuần tự 2n - 2. Về mặt thực nghiệm và mã nguồn, đồ án đã hoàn thiện trọn vẹn 3 hàm cơ sở trong module DeTai (Julia 1.12.7): kiem_tra_dau_vao, min_max và min_max_truc_tiep, xây dựng kịch bản benchmark.jl đo đạc trên 4 quy mô n in {5, 20, 100, 500}, hoàn thành trọn vẹn bộ kiểm thử 12 ca độc lập (45 phép assert) đạt 100% Pass trong test/runtests.jl. Mã nguồn đã được chốt mốc Commit C (6a186eace8934a81795104bc494d83eb3633124e) và đồng bộ lên GitHub. Báo cáo hoàn thành đầy đủ Chương 3, Chương 4, bảng lần vết tay mảng 3 phần tử và chèn đủ 11 ảnh minh chứng thực nghiệm A01 - A11.</w:t>
+            <w:t>Báo cáo tiến độ 2 (Mốc 2) hoàn thành toàn diện các mục tiêu trọng tâm của đề tài DT046: Tìm đồng thời giá trị nhỏ nhất và lớn nhất. Về mặt lý thuyết, đồ án đã phân tích chi tiết nguyên lý chia để trị, cơ chế tối ưu tại trường hợp cơ sở 2 phần tử (chỉ tốn đúng 1 phép so sánh giá trị) và bước ghép 2 nửa (tốn 2 phép so sánh), thiết lập và giải hệ thức đệ quy T(n) = 2T(n/2) + 2 để chứng minh số phép so sánh đạt 3n/2 - 2 khi n là lũy thừa 2, tiết kiệm khoảng 25% số phép so sánh so với phương pháp duyệt tuần tự 2n - 2. Về mặt thực nghiệm và mã nguồn, đồ án đã hoàn thiện trọn vẹn 3 hàm cơ sở trong module DeTai (Julia 1.12.7): kiem_tra_dau_vao, min_max và min_max_truc_tiep, xây dựng kịch bản benchmark.jl đo đạc trên 4 quy mô n in {5, 20, 100, 500}, hoàn thành trọn vẹn bộ kiểm thử 12 ca độc lập (45 phép assert) đạt 100% Pass trong test/runtests.jl. Mã nguồn đã được chốt mốc Commit C (43bc4a301fafb9d54c9396c20bfcfe67fded5a1e) và đồng bộ lên GitHub. Báo cáo hoàn thành đầy đủ Chương 3, Chương 4, bảng lần vết tay mảng 3 phần tử và chèn đủ 11 ảnh minh chứng thực nghiệm A01 - A11.</w:t>
           </w:r>
         </w:sdtContent>
       </w:sdt>
@@ -13282,7 +13282,7 @@
             <w:rPr>
               <w:sz w:val="24"/>
             </w:rPr>
-            <w:t>Toàn bộ mã nguồn hoàn chỉnh của đề tài được đặt trong kho lưu trữ Git tại tệp `src/DeTai.jl` (Commit C: 6a186eace8934a81795104bc494d83eb3633124e). Mã nguồn được lập trình bằng ngôn ngữ Julia 1.12.7, có đầy đủ docstring giải thích, hỗ trợ chế độ chạy demo, đo đạc benchmark và bộ kiểm thử 12 ca tự động.</w:t>
+            <w:t>Toàn bộ mã nguồn hoàn chỉnh của đề tài được đặt trong kho lưu trữ Git tại tệp `src/DeTai.jl` (Commit C: 43bc4a301fafb9d54c9396c20bfcfe67fded5a1e). Mã nguồn được lập trình bằng ngôn ngữ Julia 1.12.7, có đầy đủ docstring giải thích, hỗ trợ chế độ chạy demo, đo đạc benchmark và bộ kiểm thử 12 ca tự động.</w:t>
           </w:r>
         </w:sdtContent>
       </w:sdt>
@@ -17833,7 +17833,7 @@
                   <w:rPr>
                     <w:sz w:val="23"/>
                   </w:rPr>
-                  <w:t>6a186eace8</w:t>
+                  <w:t>43bc4a301f</w:t>
                 </w:r>
               </w:sdtContent>
             </w:sdt>
@@ -17946,7 +17946,7 @@
                   <w:rPr>
                     <w:sz w:val="23"/>
                   </w:rPr>
-                  <w:t>6a186eace8</w:t>
+                  <w:t>43bc4a301f</w:t>
                 </w:r>
               </w:sdtContent>
             </w:sdt>
@@ -18059,7 +18059,7 @@
                   <w:rPr>
                     <w:sz w:val="23"/>
                   </w:rPr>
-                  <w:t>6a186eace8</w:t>
+                  <w:t>43bc4a301f</w:t>
                 </w:r>
               </w:sdtContent>
             </w:sdt>
@@ -18172,7 +18172,7 @@
                   <w:rPr>
                     <w:sz w:val="23"/>
                   </w:rPr>
-                  <w:t>6a186eace8</w:t>
+                  <w:t>43bc4a301f</w:t>
                 </w:r>
               </w:sdtContent>
             </w:sdt>
@@ -18285,7 +18285,7 @@
                   <w:rPr>
                     <w:sz w:val="23"/>
                   </w:rPr>
-                  <w:t>6a186eace8</w:t>
+                  <w:t>43bc4a301f</w:t>
                 </w:r>
               </w:sdtContent>
             </w:sdt>
@@ -18398,7 +18398,7 @@
                   <w:rPr>
                     <w:sz w:val="23"/>
                   </w:rPr>
-                  <w:t>6a186eace8</w:t>
+                  <w:t>43bc4a301f</w:t>
                 </w:r>
               </w:sdtContent>
             </w:sdt>
@@ -18511,7 +18511,7 @@
                   <w:rPr>
                     <w:sz w:val="23"/>
                   </w:rPr>
-                  <w:t>6a186eace8</w:t>
+                  <w:t>43bc4a301f</w:t>
                 </w:r>
               </w:sdtContent>
             </w:sdt>
@@ -18624,7 +18624,7 @@
                   <w:rPr>
                     <w:sz w:val="23"/>
                   </w:rPr>
-                  <w:t>6a186eace8</w:t>
+                  <w:t>43bc4a301f</w:t>
                 </w:r>
               </w:sdtContent>
             </w:sdt>
@@ -18754,7 +18754,7 @@
                   <w:rPr>
                     <w:sz w:val="23"/>
                   </w:rPr>
-                  <w:t>6a186eace8</w:t>
+                  <w:t>43bc4a301f</w:t>
                 </w:r>
               </w:sdtContent>
             </w:sdt>
@@ -18884,7 +18884,7 @@
                   <w:rPr>
                     <w:sz w:val="23"/>
                   </w:rPr>
-                  <w:t>6a186eace8</w:t>
+                  <w:t>43bc4a301f</w:t>
                 </w:r>
               </w:sdtContent>
             </w:sdt>
@@ -19014,7 +19014,7 @@
                   <w:rPr>
                     <w:sz w:val="23"/>
                   </w:rPr>
-                  <w:t>6a186eace8</w:t>
+                  <w:t>43bc4a301f</w:t>
                 </w:r>
               </w:sdtContent>
             </w:sdt>
@@ -19144,7 +19144,7 @@
                   <w:rPr>
                     <w:sz w:val="23"/>
                   </w:rPr>
-                  <w:t>6a186eace8</w:t>
+                  <w:t>43bc4a301f</w:t>
                 </w:r>
               </w:sdtContent>
             </w:sdt>
@@ -21724,7 +21724,7 @@
             <w:rPr>
               <w:sz w:val="24"/>
             </w:rPr>
-            <w:t>Kho lưu trữ mã nguồn của đề tài được xuất bản công khai trên GitHub tại địa chỉ: https://github.com/namnh9681-sys/N24DCDT051_DT046_NguyenHoangNam. Toàn bộ mã nguồn tại Mốc 2 được chốt tại Commit C có mã băm SHA đầy đủ là: `6a186eace8934a81795104bc494d83eb3633124e`. Mọi kết quả thực nghiệm, dữ liệu kiểm thử và hình ảnh trong báo cáo đều được tạo ra trực tiếp từ mã nguồn tại commit này.</w:t>
+            <w:t>Kho lưu trữ mã nguồn của đề tài được xuất bản công khai trên GitHub tại địa chỉ: https://github.com/namnh9681-sys/N24DCDT051_DT046_NguyenHoangNam. Toàn bộ mã nguồn tại Mốc 2 được chốt tại Commit C có mã băm SHA đầy đủ là: `43bc4a301fafb9d54c9396c20bfcfe67fded5a1e`. Mọi kết quả thực nghiệm, dữ liệu kiểm thử và hình ảnh trong báo cáo đều được tạo ra trực tiếp từ mã nguồn tại commit này.</w:t>
           </w:r>
         </w:sdtContent>
       </w:sdt>
@@ -21902,7 +21902,7 @@
                   <w:rPr>
                     <w:sz w:val="23"/>
                   </w:rPr>
-                  <w:t>6a186eace8934a81795104bc494d83eb3633124e</w:t>
+                  <w:t>43bc4a301fafb9d54c9396c20bfcfe67fded5a1e</w:t>
                 </w:r>
               </w:sdtContent>
             </w:sdt>
@@ -21952,7 +21952,7 @@
                   <w:rPr>
                     <w:sz w:val="23"/>
                   </w:rPr>
-                  <w:t>6a186eace8934a81795104bc494d83eb3633124e (đồng nhất tại Mốc 2)</w:t>
+                  <w:t>43bc4a301fafb9d54c9396c20bfcfe67fded5a1e (đồng nhất tại Mốc 2)</w:t>
                 </w:r>
               </w:sdtContent>
             </w:sdt>
@@ -22002,7 +22002,7 @@
                   <w:rPr>
                     <w:sz w:val="23"/>
                   </w:rPr>
-                  <w:t>https://github.com/namnh9681-sys/N24DCDT051_DT046_NguyenHoangNam/blob/6a186eace8934a81795104bc494d83eb3633124e/src/DeTai.jl</w:t>
+                  <w:t>https://github.com/namnh9681-sys/N24DCDT051_DT046_NguyenHoangNam/blob/43bc4a301fafb9d54c9396c20bfcfe67fded5a1e/src/DeTai.jl</w:t>
                 </w:r>
               </w:sdtContent>
             </w:sdt>
@@ -22433,7 +22433,7 @@
             <w:rPr>
               <w:sz w:val="24"/>
             </w:rPr>
-            <w:t>Hình 4.11: Giao diện repository GitHub thật của sinh viên tại Commit C (6a186eace8)</w:t>
+            <w:t>Hình 4.11: Giao diện repository GitHub thật của sinh viên tại Commit C (43bc4a301f)</w:t>
           </w:r>
         </w:sdtContent>
       </w:sdt>
@@ -23517,7 +23517,7 @@
                   <w:rPr>
                     <w:sz w:val="23"/>
                   </w:rPr>
-                  <w:t>6a186eace8</w:t>
+                  <w:t>43bc4a301f</w:t>
                 </w:r>
               </w:sdtContent>
             </w:sdt>
@@ -23591,7 +23591,7 @@
                   <w:rPr>
                     <w:sz w:val="23"/>
                   </w:rPr>
-                  <w:t>6a186eace8</w:t>
+                  <w:t>43bc4a301f</w:t>
                 </w:r>
               </w:sdtContent>
             </w:sdt>
@@ -23665,7 +23665,7 @@
                   <w:rPr>
                     <w:sz w:val="23"/>
                   </w:rPr>
-                  <w:t>6a186eace8</w:t>
+                  <w:t>43bc4a301f</w:t>
                 </w:r>
               </w:sdtContent>
             </w:sdt>
@@ -23739,7 +23739,7 @@
                   <w:rPr>
                     <w:sz w:val="23"/>
                   </w:rPr>
-                  <w:t>6a186eace8</w:t>
+                  <w:t>43bc4a301f</w:t>
                 </w:r>
               </w:sdtContent>
             </w:sdt>
@@ -23813,7 +23813,7 @@
                   <w:rPr>
                     <w:sz w:val="23"/>
                   </w:rPr>
-                  <w:t>6a186eace8</w:t>
+                  <w:t>43bc4a301f</w:t>
                 </w:r>
               </w:sdtContent>
             </w:sdt>
@@ -23887,7 +23887,7 @@
                   <w:rPr>
                     <w:sz w:val="23"/>
                   </w:rPr>
-                  <w:t>6a186eace8</w:t>
+                  <w:t>43bc4a301f</w:t>
                 </w:r>
               </w:sdtContent>
             </w:sdt>
@@ -23961,7 +23961,7 @@
                   <w:rPr>
                     <w:sz w:val="23"/>
                   </w:rPr>
-                  <w:t>6a186eace8</w:t>
+                  <w:t>43bc4a301f</w:t>
                 </w:r>
               </w:sdtContent>
             </w:sdt>
@@ -24035,7 +24035,7 @@
                   <w:rPr>
                     <w:sz w:val="23"/>
                   </w:rPr>
-                  <w:t>6a186eace8</w:t>
+                  <w:t>43bc4a301f</w:t>
                 </w:r>
               </w:sdtContent>
             </w:sdt>
@@ -24109,7 +24109,7 @@
                   <w:rPr>
                     <w:sz w:val="23"/>
                   </w:rPr>
-                  <w:t>6a186eace8</w:t>
+                  <w:t>43bc4a301f</w:t>
                 </w:r>
               </w:sdtContent>
             </w:sdt>
@@ -24183,7 +24183,7 @@
                   <w:rPr>
                     <w:sz w:val="23"/>
                   </w:rPr>
-                  <w:t>6a186eace8</w:t>
+                  <w:t>43bc4a301f</w:t>
                 </w:r>
               </w:sdtContent>
             </w:sdt>
@@ -24257,7 +24257,7 @@
                   <w:rPr>
                     <w:sz w:val="23"/>
                   </w:rPr>
-                  <w:t>6a186eace8</w:t>
+                  <w:t>43bc4a301f</w:t>
                 </w:r>
               </w:sdtContent>
             </w:sdt>
@@ -24850,7 +24850,7 @@
             <w:rPr>
               <w:sz w:val="24"/>
             </w:rPr>
-            <w:t>6a186eace8934a81795104bc494d83eb3633124e</w:t>
+            <w:t>43bc4a301fafb9d54c9396c20bfcfe67fded5a1e</w:t>
           </w:r>
         </w:sdtContent>
       </w:sdt>
@@ -24873,7 +24873,7 @@
             <w:rPr>
               <w:sz w:val="24"/>
             </w:rPr>
-            <w:t>6a186eace8934a81795104bc494d83eb3633124e (Đồng nhất giữa C và S)</w:t>
+            <w:t>43bc4a301fafb9d54c9396c20bfcfe67fded5a1e (Đồng nhất giữa C và S)</w:t>
           </w:r>
         </w:sdtContent>
       </w:sdt>
@@ -24904,7 +24904,7 @@
             <w:rPr>
               <w:sz w:val="24"/>
             </w:rPr>
-            <w:t>https://github.com/namnh9681-sys/N24DCDT051_DT046_NguyenHoangNam/blob/6a186eace8934a81795104bc494d83eb3633124e/src/DeTai.jl</w:t>
+            <w:t>https://github.com/namnh9681-sys/N24DCDT051_DT046_NguyenHoangNam/blob/43bc4a301fafb9d54c9396c20bfcfe67fded5a1e/src/DeTai.jl</w:t>
           </w:r>
         </w:sdtContent>
       </w:sdt>

</xml_diff>